<commit_message>
Modified rekap nilai kolokium template
</commit_message>
<xml_diff>
--- a/storage/app/templates/rekap_nilai_kolokium_1.docx
+++ b/storage/app/templates/rekap_nilai_kolokium_1.docx
@@ -181,7 +181,25 @@
                                 <w:sz w:val="20"/>
                                 <w:szCs w:val="16"/>
                               </w:rPr>
-                              <w:t>Kampus IPB Dramaga, Bogor 16680</w:t>
+                              <w:t xml:space="preserve">Kampus IPB </w:t>
+                            </w:r>
+                            <w:proofErr w:type="spellStart"/>
+                            <w:r>
+                              <w:rPr>
+                                <w:rFonts w:ascii="Barmeno Regular" w:hAnsi="Barmeno Regular" w:cs="Calibri"/>
+                                <w:sz w:val="20"/>
+                                <w:szCs w:val="16"/>
+                              </w:rPr>
+                              <w:t>Dramaga</w:t>
+                            </w:r>
+                            <w:proofErr w:type="spellEnd"/>
+                            <w:r>
+                              <w:rPr>
+                                <w:rFonts w:ascii="Barmeno Regular" w:hAnsi="Barmeno Regular" w:cs="Calibri"/>
+                                <w:sz w:val="20"/>
+                                <w:szCs w:val="16"/>
+                              </w:rPr>
+                              <w:t>, Bogor 16680</w:t>
                             </w:r>
                           </w:p>
                           <w:p>
@@ -226,6 +244,7 @@
                                 <w:szCs w:val="16"/>
                               </w:rPr>
                             </w:pPr>
+                            <w:proofErr w:type="spellStart"/>
                             <w:r>
                               <w:rPr>
                                 <w:rFonts w:ascii="Barmeno Regular" w:hAnsi="Barmeno Regular" w:cs="Calibri"/>
@@ -234,6 +253,7 @@
                               </w:rPr>
                               <w:t>Facsimile</w:t>
                             </w:r>
+                            <w:proofErr w:type="spellEnd"/>
                             <w:r>
                               <w:rPr>
                                 <w:rFonts w:ascii="Barmeno Regular" w:hAnsi="Barmeno Regular" w:cs="Calibri"/>
@@ -368,7 +388,25 @@
                           <w:sz w:val="20"/>
                           <w:szCs w:val="16"/>
                         </w:rPr>
-                        <w:t>Kampus IPB Dramaga, Bogor 16680</w:t>
+                        <w:t xml:space="preserve">Kampus IPB </w:t>
+                      </w:r>
+                      <w:proofErr w:type="spellStart"/>
+                      <w:r>
+                        <w:rPr>
+                          <w:rFonts w:ascii="Barmeno Regular" w:hAnsi="Barmeno Regular" w:cs="Calibri"/>
+                          <w:sz w:val="20"/>
+                          <w:szCs w:val="16"/>
+                        </w:rPr>
+                        <w:t>Dramaga</w:t>
+                      </w:r>
+                      <w:proofErr w:type="spellEnd"/>
+                      <w:r>
+                        <w:rPr>
+                          <w:rFonts w:ascii="Barmeno Regular" w:hAnsi="Barmeno Regular" w:cs="Calibri"/>
+                          <w:sz w:val="20"/>
+                          <w:szCs w:val="16"/>
+                        </w:rPr>
+                        <w:t>, Bogor 16680</w:t>
                       </w:r>
                     </w:p>
                     <w:p>
@@ -413,6 +451,7 @@
                           <w:szCs w:val="16"/>
                         </w:rPr>
                       </w:pPr>
+                      <w:proofErr w:type="spellStart"/>
                       <w:r>
                         <w:rPr>
                           <w:rFonts w:ascii="Barmeno Regular" w:hAnsi="Barmeno Regular" w:cs="Calibri"/>
@@ -421,6 +460,7 @@
                         </w:rPr>
                         <w:t>Facsimile</w:t>
                       </w:r>
+                      <w:proofErr w:type="spellEnd"/>
                       <w:r>
                         <w:rPr>
                           <w:rFonts w:ascii="Barmeno Regular" w:hAnsi="Barmeno Regular" w:cs="Calibri"/>
@@ -1067,8 +1107,17 @@
           <w:rFonts w:ascii="Times New Roman" w:eastAsia="Times New Roman" w:hAnsi="Times New Roman"/>
           <w:lang w:val="en-US"/>
         </w:rPr>
-        <w:t>Nama Mahasiswa</w:t>
-      </w:r>
+        <w:t xml:space="preserve">Nama </w:t>
+      </w:r>
+      <w:proofErr w:type="spellStart"/>
+      <w:r>
+        <w:rPr>
+          <w:rFonts w:ascii="Times New Roman" w:eastAsia="Times New Roman" w:hAnsi="Times New Roman"/>
+          <w:lang w:val="en-US"/>
+        </w:rPr>
+        <w:t>Mahasiswa</w:t>
+      </w:r>
+      <w:proofErr w:type="spellEnd"/>
       <w:r>
         <w:rPr>
           <w:rFonts w:ascii="Times New Roman" w:eastAsia="Times New Roman" w:hAnsi="Times New Roman"/>
@@ -1170,8 +1219,17 @@
           <w:rFonts w:ascii="Times New Roman" w:eastAsia="Times New Roman" w:hAnsi="Times New Roman"/>
           <w:lang w:val="en-US"/>
         </w:rPr>
-        <w:t>Hari/Tanggal</w:t>
-      </w:r>
+        <w:t>Hari/</w:t>
+      </w:r>
+      <w:proofErr w:type="spellStart"/>
+      <w:r>
+        <w:rPr>
+          <w:rFonts w:ascii="Times New Roman" w:eastAsia="Times New Roman" w:hAnsi="Times New Roman"/>
+          <w:lang w:val="en-US"/>
+        </w:rPr>
+        <w:t>Tanggal</w:t>
+      </w:r>
+      <w:proofErr w:type="spellEnd"/>
       <w:r>
         <w:rPr>
           <w:rFonts w:ascii="Times New Roman" w:eastAsia="Times New Roman" w:hAnsi="Times New Roman"/>
@@ -1199,7 +1257,23 @@
           <w:rFonts w:ascii="Times New Roman" w:eastAsia="Times New Roman" w:hAnsi="Times New Roman"/>
           <w:lang w:val="en-US"/>
         </w:rPr>
-        <w:t>${hari_tanggal}</w:t>
+        <w:t>${</w:t>
+      </w:r>
+      <w:proofErr w:type="spellStart"/>
+      <w:r>
+        <w:rPr>
+          <w:rFonts w:ascii="Times New Roman" w:eastAsia="Times New Roman" w:hAnsi="Times New Roman"/>
+          <w:lang w:val="en-US"/>
+        </w:rPr>
+        <w:t>hari_tanggal</w:t>
+      </w:r>
+      <w:proofErr w:type="spellEnd"/>
+      <w:r>
+        <w:rPr>
+          <w:rFonts w:ascii="Times New Roman" w:eastAsia="Times New Roman" w:hAnsi="Times New Roman"/>
+          <w:lang w:val="en-US"/>
+        </w:rPr>
+        <w:t>}</w:t>
       </w:r>
     </w:p>
     <w:p>
@@ -1222,8 +1296,17 @@
           <w:rFonts w:ascii="Times New Roman" w:eastAsia="Times New Roman" w:hAnsi="Times New Roman"/>
           <w:lang w:val="en-US"/>
         </w:rPr>
-        <w:t>Waktu/Tempat</w:t>
-      </w:r>
+        <w:t>Waktu/</w:t>
+      </w:r>
+      <w:proofErr w:type="spellStart"/>
+      <w:r>
+        <w:rPr>
+          <w:rFonts w:ascii="Times New Roman" w:eastAsia="Times New Roman" w:hAnsi="Times New Roman"/>
+          <w:lang w:val="en-US"/>
+        </w:rPr>
+        <w:t>Tempat</w:t>
+      </w:r>
+      <w:proofErr w:type="spellEnd"/>
       <w:r>
         <w:rPr>
           <w:rFonts w:ascii="Times New Roman" w:eastAsia="Times New Roman" w:hAnsi="Times New Roman"/>
@@ -1243,7 +1326,23 @@
           <w:rFonts w:ascii="Times New Roman" w:eastAsia="Times New Roman" w:hAnsi="Times New Roman"/>
           <w:lang w:val="en-US"/>
         </w:rPr>
-        <w:t>${waktu_tempat}</w:t>
+        <w:t>${</w:t>
+      </w:r>
+      <w:proofErr w:type="spellStart"/>
+      <w:r>
+        <w:rPr>
+          <w:rFonts w:ascii="Times New Roman" w:eastAsia="Times New Roman" w:hAnsi="Times New Roman"/>
+          <w:lang w:val="en-US"/>
+        </w:rPr>
+        <w:t>waktu_tempat</w:t>
+      </w:r>
+      <w:proofErr w:type="spellEnd"/>
+      <w:r>
+        <w:rPr>
+          <w:rFonts w:ascii="Times New Roman" w:eastAsia="Times New Roman" w:hAnsi="Times New Roman"/>
+          <w:lang w:val="en-US"/>
+        </w:rPr>
+        <w:t>}</w:t>
       </w:r>
     </w:p>
     <w:p>
@@ -1261,12 +1360,21 @@
           <w:lang w:val="en-US"/>
         </w:rPr>
       </w:pPr>
-      <w:r>
-        <w:rPr>
-          <w:rFonts w:ascii="Times New Roman" w:eastAsia="Times New Roman" w:hAnsi="Times New Roman"/>
-          <w:lang w:val="en-US"/>
-        </w:rPr>
-        <w:t xml:space="preserve">Judul </w:t>
+      <w:proofErr w:type="spellStart"/>
+      <w:r>
+        <w:rPr>
+          <w:rFonts w:ascii="Times New Roman" w:eastAsia="Times New Roman" w:hAnsi="Times New Roman"/>
+          <w:lang w:val="en-US"/>
+        </w:rPr>
+        <w:t>Judul</w:t>
+      </w:r>
+      <w:proofErr w:type="spellEnd"/>
+      <w:r>
+        <w:rPr>
+          <w:rFonts w:ascii="Times New Roman" w:eastAsia="Times New Roman" w:hAnsi="Times New Roman"/>
+          <w:lang w:val="en-US"/>
+        </w:rPr>
+        <w:t xml:space="preserve"> </w:t>
       </w:r>
       <w:r>
         <w:rPr>
@@ -1295,7 +1403,23 @@
           <w:rFonts w:ascii="Times New Roman" w:eastAsia="Times New Roman" w:hAnsi="Times New Roman"/>
           <w:lang w:val="en-US"/>
         </w:rPr>
-        <w:t>${judul}</w:t>
+        <w:t>${</w:t>
+      </w:r>
+      <w:proofErr w:type="spellStart"/>
+      <w:r>
+        <w:rPr>
+          <w:rFonts w:ascii="Times New Roman" w:eastAsia="Times New Roman" w:hAnsi="Times New Roman"/>
+          <w:lang w:val="en-US"/>
+        </w:rPr>
+        <w:t>judul</w:t>
+      </w:r>
+      <w:proofErr w:type="spellEnd"/>
+      <w:r>
+        <w:rPr>
+          <w:rFonts w:ascii="Times New Roman" w:eastAsia="Times New Roman" w:hAnsi="Times New Roman"/>
+          <w:lang w:val="en-US"/>
+        </w:rPr>
+        <w:t>}</w:t>
       </w:r>
     </w:p>
     <w:p>
@@ -1358,6 +1482,7 @@
         </w:rPr>
         <w:t xml:space="preserve">Daftar Nilai </w:t>
       </w:r>
+      <w:proofErr w:type="spellStart"/>
       <w:r>
         <w:rPr>
           <w:rFonts w:ascii="Times New Roman" w:eastAsia="Times New Roman" w:hAnsi="Times New Roman"/>
@@ -1368,6 +1493,7 @@
         </w:rPr>
         <w:t>Kolokium</w:t>
       </w:r>
+      <w:proofErr w:type="spellEnd"/>
       <w:r>
         <w:rPr>
           <w:rFonts w:ascii="Times New Roman" w:eastAsia="Times New Roman" w:hAnsi="Times New Roman"/>
@@ -1607,6 +1733,7 @@
                 <w:lang w:val="en-US"/>
               </w:rPr>
             </w:pPr>
+            <w:proofErr w:type="spellStart"/>
             <w:r>
               <w:rPr>
                 <w:rFonts w:ascii="Times New Roman" w:eastAsia="Times New Roman" w:hAnsi="Times New Roman"/>
@@ -1616,6 +1743,7 @@
               </w:rPr>
               <w:t>Bobot</w:t>
             </w:r>
+            <w:proofErr w:type="spellEnd"/>
           </w:p>
           <w:p>
             <w:pPr>
@@ -1661,8 +1789,19 @@
                 <w:szCs w:val="24"/>
                 <w:lang w:val="en-US"/>
               </w:rPr>
-              <w:t>Nilai x Bobot</w:t>
+              <w:t xml:space="preserve">Nilai x </w:t>
             </w:r>
+            <w:proofErr w:type="spellStart"/>
+            <w:r>
+              <w:rPr>
+                <w:rFonts w:ascii="Times New Roman" w:eastAsia="Times New Roman" w:hAnsi="Times New Roman"/>
+                <w:sz w:val="24"/>
+                <w:szCs w:val="24"/>
+                <w:lang w:val="en-US"/>
+              </w:rPr>
+              <w:t>Bobot</w:t>
+            </w:r>
+            <w:proofErr w:type="spellEnd"/>
           </w:p>
         </w:tc>
       </w:tr>
@@ -1719,7 +1858,29 @@
                 <w:szCs w:val="24"/>
                 <w:lang w:val="en-US"/>
               </w:rPr>
-              <w:t>${nama_pembimbing_utama}</w:t>
+              <w:t>${</w:t>
+            </w:r>
+            <w:proofErr w:type="spellStart"/>
+            <w:r>
+              <w:rPr>
+                <w:rFonts w:ascii="Times New Roman" w:eastAsia="Times New Roman" w:hAnsi="Times New Roman"/>
+                <w:bCs/>
+                <w:sz w:val="24"/>
+                <w:szCs w:val="24"/>
+                <w:lang w:val="en-US"/>
+              </w:rPr>
+              <w:t>nama_pembimbing_utama</w:t>
+            </w:r>
+            <w:proofErr w:type="spellEnd"/>
+            <w:r>
+              <w:rPr>
+                <w:rFonts w:ascii="Times New Roman" w:eastAsia="Times New Roman" w:hAnsi="Times New Roman"/>
+                <w:bCs/>
+                <w:sz w:val="24"/>
+                <w:szCs w:val="24"/>
+                <w:lang w:val="en-US"/>
+              </w:rPr>
+              <w:t>}</w:t>
             </w:r>
           </w:p>
         </w:tc>
@@ -1730,7 +1891,7 @@
           <w:p>
             <w:pPr>
               <w:spacing w:after="0" w:line="240" w:lineRule="auto"/>
-              <w:ind w:left="-29" w:firstLine="29"/>
+              <w:ind w:left="6" w:hanging="6"/>
               <w:rPr>
                 <w:rFonts w:ascii="Times New Roman" w:eastAsia="Times New Roman" w:hAnsi="Times New Roman"/>
                 <w:sz w:val="24"/>
@@ -1738,6 +1899,7 @@
                 <w:lang w:val="en-US"/>
               </w:rPr>
             </w:pPr>
+            <w:proofErr w:type="spellStart"/>
             <w:r>
               <w:rPr>
                 <w:rFonts w:ascii="Times New Roman" w:eastAsia="Times New Roman" w:hAnsi="Times New Roman"/>
@@ -1745,7 +1907,17 @@
                 <w:szCs w:val="24"/>
                 <w:lang w:val="en-US"/>
               </w:rPr>
-              <w:t>Pembimbing Utama</w:t>
+              <w:t>Pembimbing</w:t>
+            </w:r>
+            <w:proofErr w:type="spellEnd"/>
+            <w:r>
+              <w:rPr>
+                <w:rFonts w:ascii="Times New Roman" w:eastAsia="Times New Roman" w:hAnsi="Times New Roman"/>
+                <w:sz w:val="24"/>
+                <w:szCs w:val="24"/>
+                <w:lang w:val="en-US"/>
+              </w:rPr>
+              <w:t xml:space="preserve"> Utama</w:t>
             </w:r>
           </w:p>
         </w:tc>
@@ -1858,7 +2030,27 @@
                 <w:szCs w:val="24"/>
                 <w:lang w:val="en-US"/>
               </w:rPr>
-              <w:t>${nama_moderator}</w:t>
+              <w:t>${</w:t>
+            </w:r>
+            <w:proofErr w:type="spellStart"/>
+            <w:r>
+              <w:rPr>
+                <w:rFonts w:ascii="Times New Roman" w:eastAsia="Times New Roman" w:hAnsi="Times New Roman"/>
+                <w:sz w:val="24"/>
+                <w:szCs w:val="24"/>
+                <w:lang w:val="en-US"/>
+              </w:rPr>
+              <w:t>nama_moderator</w:t>
+            </w:r>
+            <w:proofErr w:type="spellEnd"/>
+            <w:r>
+              <w:rPr>
+                <w:rFonts w:ascii="Times New Roman" w:eastAsia="Times New Roman" w:hAnsi="Times New Roman"/>
+                <w:sz w:val="24"/>
+                <w:szCs w:val="24"/>
+                <w:lang w:val="en-US"/>
+              </w:rPr>
+              <w:t>}</w:t>
             </w:r>
           </w:p>
         </w:tc>
@@ -1885,6 +2077,7 @@
               </w:rPr>
               <w:t xml:space="preserve">Moderator </w:t>
             </w:r>
+            <w:proofErr w:type="spellStart"/>
             <w:r>
               <w:rPr>
                 <w:rFonts w:ascii="Times New Roman" w:eastAsia="Times New Roman" w:hAnsi="Times New Roman"/>
@@ -1894,6 +2087,7 @@
               </w:rPr>
               <w:t>Kolokium</w:t>
             </w:r>
+            <w:proofErr w:type="spellEnd"/>
           </w:p>
         </w:tc>
         <w:tc>
@@ -1988,7 +2182,29 @@
                 <w:szCs w:val="24"/>
                 <w:lang w:val="en-US"/>
               </w:rPr>
-              <w:t>Nilai Akhir (Hasil Pembobotan)</w:t>
+              <w:t xml:space="preserve">Nilai Akhir (Hasil </w:t>
+            </w:r>
+            <w:proofErr w:type="spellStart"/>
+            <w:r>
+              <w:rPr>
+                <w:rFonts w:ascii="Times New Roman" w:eastAsia="Times New Roman" w:hAnsi="Times New Roman"/>
+                <w:b/>
+                <w:sz w:val="24"/>
+                <w:szCs w:val="24"/>
+                <w:lang w:val="en-US"/>
+              </w:rPr>
+              <w:t>Pembobotan</w:t>
+            </w:r>
+            <w:proofErr w:type="spellEnd"/>
+            <w:r>
+              <w:rPr>
+                <w:rFonts w:ascii="Times New Roman" w:eastAsia="Times New Roman" w:hAnsi="Times New Roman"/>
+                <w:b/>
+                <w:sz w:val="24"/>
+                <w:szCs w:val="24"/>
+                <w:lang w:val="en-US"/>
+              </w:rPr>
+              <w:t>)</w:t>
             </w:r>
           </w:p>
         </w:tc>
@@ -2048,7 +2264,47 @@
           <w:szCs w:val="24"/>
           <w:lang w:val="en-US"/>
         </w:rPr>
-        <w:t>Keputusan: Mendapatkan Huruf Mutu</w:t>
+        <w:t xml:space="preserve">Keputusan: </w:t>
+      </w:r>
+      <w:proofErr w:type="spellStart"/>
+      <w:r>
+        <w:rPr>
+          <w:rFonts w:ascii="Times New Roman" w:eastAsia="Times New Roman" w:hAnsi="Times New Roman"/>
+          <w:sz w:val="24"/>
+          <w:szCs w:val="24"/>
+          <w:lang w:val="en-US"/>
+        </w:rPr>
+        <w:t>Mendapatkan</w:t>
+      </w:r>
+      <w:proofErr w:type="spellEnd"/>
+      <w:r>
+        <w:rPr>
+          <w:rFonts w:ascii="Times New Roman" w:eastAsia="Times New Roman" w:hAnsi="Times New Roman"/>
+          <w:sz w:val="24"/>
+          <w:szCs w:val="24"/>
+          <w:lang w:val="en-US"/>
+        </w:rPr>
+        <w:t xml:space="preserve"> </w:t>
+      </w:r>
+      <w:proofErr w:type="spellStart"/>
+      <w:r>
+        <w:rPr>
+          <w:rFonts w:ascii="Times New Roman" w:eastAsia="Times New Roman" w:hAnsi="Times New Roman"/>
+          <w:sz w:val="24"/>
+          <w:szCs w:val="24"/>
+          <w:lang w:val="en-US"/>
+        </w:rPr>
+        <w:t>Huruf</w:t>
+      </w:r>
+      <w:proofErr w:type="spellEnd"/>
+      <w:r>
+        <w:rPr>
+          <w:rFonts w:ascii="Times New Roman" w:eastAsia="Times New Roman" w:hAnsi="Times New Roman"/>
+          <w:sz w:val="24"/>
+          <w:szCs w:val="24"/>
+          <w:lang w:val="en-US"/>
+        </w:rPr>
+        <w:t xml:space="preserve"> Mutu</w:t>
       </w:r>
       <w:r>
         <w:rPr>
@@ -2107,8 +2363,9 @@
           <w:szCs w:val="24"/>
           <w:lang w:val="en-US"/>
         </w:rPr>
-        <w:t xml:space="preserve">Tanda tangan Tim Penilai </w:t>
-      </w:r>
+        <w:t xml:space="preserve">Tanda </w:t>
+      </w:r>
+      <w:proofErr w:type="spellStart"/>
       <w:r>
         <w:rPr>
           <w:rFonts w:ascii="Times New Roman" w:eastAsia="Times New Roman" w:hAnsi="Times New Roman"/>
@@ -2117,8 +2374,31 @@
           <w:szCs w:val="24"/>
           <w:lang w:val="en-US"/>
         </w:rPr>
+        <w:t>tangan</w:t>
+      </w:r>
+      <w:proofErr w:type="spellEnd"/>
+      <w:r>
+        <w:rPr>
+          <w:rFonts w:ascii="Times New Roman" w:eastAsia="Times New Roman" w:hAnsi="Times New Roman"/>
+          <w:b/>
+          <w:sz w:val="24"/>
+          <w:szCs w:val="24"/>
+          <w:lang w:val="en-US"/>
+        </w:rPr>
+        <w:t xml:space="preserve"> Tim Penilai </w:t>
+      </w:r>
+      <w:proofErr w:type="spellStart"/>
+      <w:r>
+        <w:rPr>
+          <w:rFonts w:ascii="Times New Roman" w:eastAsia="Times New Roman" w:hAnsi="Times New Roman"/>
+          <w:b/>
+          <w:sz w:val="24"/>
+          <w:szCs w:val="24"/>
+          <w:lang w:val="en-US"/>
+        </w:rPr>
         <w:t>Kolokium</w:t>
       </w:r>
+      <w:proofErr w:type="spellEnd"/>
     </w:p>
     <w:p>
       <w:pPr>
@@ -2136,14 +2416,25 @@
           <w:lang w:val="en-US"/>
         </w:rPr>
       </w:pPr>
-      <w:r>
-        <w:rPr>
-          <w:rFonts w:ascii="Times New Roman" w:eastAsia="Times New Roman" w:hAnsi="Times New Roman"/>
-          <w:sz w:val="24"/>
-          <w:szCs w:val="24"/>
-          <w:lang w:val="en-US"/>
-        </w:rPr>
-        <w:t>Pembimbing Utama</w:t>
+      <w:proofErr w:type="spellStart"/>
+      <w:r>
+        <w:rPr>
+          <w:rFonts w:ascii="Times New Roman" w:eastAsia="Times New Roman" w:hAnsi="Times New Roman"/>
+          <w:sz w:val="24"/>
+          <w:szCs w:val="24"/>
+          <w:lang w:val="en-US"/>
+        </w:rPr>
+        <w:t>Pembimbing</w:t>
+      </w:r>
+      <w:proofErr w:type="spellEnd"/>
+      <w:r>
+        <w:rPr>
+          <w:rFonts w:ascii="Times New Roman" w:eastAsia="Times New Roman" w:hAnsi="Times New Roman"/>
+          <w:sz w:val="24"/>
+          <w:szCs w:val="24"/>
+          <w:lang w:val="en-US"/>
+        </w:rPr>
+        <w:t xml:space="preserve"> Utama</w:t>
       </w:r>
       <w:r>
         <w:rPr>
@@ -2181,15 +2472,37 @@
           <w:lang w:val="en-US"/>
         </w:rPr>
       </w:pPr>
-      <w:r>
-        <w:rPr>
-          <w:rFonts w:ascii="Times New Roman" w:eastAsia="Times New Roman" w:hAnsi="Times New Roman"/>
-          <w:sz w:val="24"/>
-          <w:szCs w:val="24"/>
-          <w:lang w:val="en-US"/>
-        </w:rPr>
-        <w:t>Pembimbing Anggota</w:t>
-      </w:r>
+      <w:proofErr w:type="spellStart"/>
+      <w:r>
+        <w:rPr>
+          <w:rFonts w:ascii="Times New Roman" w:eastAsia="Times New Roman" w:hAnsi="Times New Roman"/>
+          <w:sz w:val="24"/>
+          <w:szCs w:val="24"/>
+          <w:lang w:val="en-US"/>
+        </w:rPr>
+        <w:t>Pembimbing</w:t>
+      </w:r>
+      <w:proofErr w:type="spellEnd"/>
+      <w:r>
+        <w:rPr>
+          <w:rFonts w:ascii="Times New Roman" w:eastAsia="Times New Roman" w:hAnsi="Times New Roman"/>
+          <w:sz w:val="24"/>
+          <w:szCs w:val="24"/>
+          <w:lang w:val="en-US"/>
+        </w:rPr>
+        <w:t xml:space="preserve"> </w:t>
+      </w:r>
+      <w:proofErr w:type="spellStart"/>
+      <w:r>
+        <w:rPr>
+          <w:rFonts w:ascii="Times New Roman" w:eastAsia="Times New Roman" w:hAnsi="Times New Roman"/>
+          <w:sz w:val="24"/>
+          <w:szCs w:val="24"/>
+          <w:lang w:val="en-US"/>
+        </w:rPr>
+        <w:t>Anggota</w:t>
+      </w:r>
+      <w:proofErr w:type="spellEnd"/>
       <w:r>
         <w:rPr>
           <w:rFonts w:ascii="Times New Roman" w:eastAsia="Times New Roman" w:hAnsi="Times New Roman"/>
@@ -2232,8 +2545,19 @@
           <w:szCs w:val="24"/>
           <w:lang w:val="en-US"/>
         </w:rPr>
-        <w:t>Moderator Seminar</w:t>
-      </w:r>
+        <w:t xml:space="preserve">Moderator </w:t>
+      </w:r>
+      <w:proofErr w:type="spellStart"/>
+      <w:r>
+        <w:rPr>
+          <w:rFonts w:ascii="Times New Roman" w:eastAsia="Times New Roman" w:hAnsi="Times New Roman"/>
+          <w:sz w:val="24"/>
+          <w:szCs w:val="24"/>
+          <w:lang w:val="en-US"/>
+        </w:rPr>
+        <w:t>Kolokium</w:t>
+      </w:r>
+      <w:proofErr w:type="spellEnd"/>
       <w:r>
         <w:rPr>
           <w:rFonts w:ascii="Times New Roman" w:eastAsia="Times New Roman" w:hAnsi="Times New Roman"/>
@@ -2283,14 +2607,25 @@
           <w:lang w:val="en-US"/>
         </w:rPr>
       </w:pPr>
-      <w:r>
-        <w:rPr>
-          <w:rFonts w:ascii="Times New Roman" w:eastAsia="Times New Roman" w:hAnsi="Times New Roman"/>
-          <w:sz w:val="24"/>
-          <w:szCs w:val="24"/>
-          <w:lang w:val="en-US"/>
-        </w:rPr>
-        <w:t>Mengesahkan,</w:t>
+      <w:proofErr w:type="spellStart"/>
+      <w:r>
+        <w:rPr>
+          <w:rFonts w:ascii="Times New Roman" w:eastAsia="Times New Roman" w:hAnsi="Times New Roman"/>
+          <w:sz w:val="24"/>
+          <w:szCs w:val="24"/>
+          <w:lang w:val="en-US"/>
+        </w:rPr>
+        <w:t>Mengesahkan</w:t>
+      </w:r>
+      <w:proofErr w:type="spellEnd"/>
+      <w:r>
+        <w:rPr>
+          <w:rFonts w:ascii="Times New Roman" w:eastAsia="Times New Roman" w:hAnsi="Times New Roman"/>
+          <w:sz w:val="24"/>
+          <w:szCs w:val="24"/>
+          <w:lang w:val="en-US"/>
+        </w:rPr>
+        <w:t>,</w:t>
       </w:r>
     </w:p>
     <w:p>
@@ -2305,14 +2640,25 @@
           <w:lang w:val="en-US"/>
         </w:rPr>
       </w:pPr>
-      <w:r>
-        <w:rPr>
-          <w:rFonts w:ascii="Times New Roman" w:eastAsia="Times New Roman" w:hAnsi="Times New Roman"/>
-          <w:sz w:val="24"/>
-          <w:szCs w:val="24"/>
-          <w:lang w:val="en-US"/>
-        </w:rPr>
-        <w:t>Ketua,</w:t>
+      <w:proofErr w:type="spellStart"/>
+      <w:r>
+        <w:rPr>
+          <w:rFonts w:ascii="Times New Roman" w:eastAsia="Times New Roman" w:hAnsi="Times New Roman"/>
+          <w:sz w:val="24"/>
+          <w:szCs w:val="24"/>
+          <w:lang w:val="en-US"/>
+        </w:rPr>
+        <w:t>Ketua</w:t>
+      </w:r>
+      <w:proofErr w:type="spellEnd"/>
+      <w:r>
+        <w:rPr>
+          <w:rFonts w:ascii="Times New Roman" w:eastAsia="Times New Roman" w:hAnsi="Times New Roman"/>
+          <w:sz w:val="24"/>
+          <w:szCs w:val="24"/>
+          <w:lang w:val="en-US"/>
+        </w:rPr>
+        <w:t>,</w:t>
       </w:r>
     </w:p>
     <w:p>
@@ -2384,8 +2730,45 @@
           <w:u w:val="single"/>
           <w:lang w:val="en-US"/>
         </w:rPr>
-        <w:t>Dr. Ati Dwi Nurhayati S.Hut., M.Si</w:t>
-      </w:r>
+        <w:t xml:space="preserve">Dr. Ati Dwi Nurhayati </w:t>
+      </w:r>
+      <w:proofErr w:type="spellStart"/>
+      <w:r>
+        <w:rPr>
+          <w:rFonts w:ascii="Times New Roman" w:eastAsia="Times New Roman" w:hAnsi="Times New Roman"/>
+          <w:b/>
+          <w:sz w:val="24"/>
+          <w:szCs w:val="24"/>
+          <w:u w:val="single"/>
+          <w:lang w:val="en-US"/>
+        </w:rPr>
+        <w:t>S.Hut</w:t>
+      </w:r>
+      <w:proofErr w:type="spellEnd"/>
+      <w:r>
+        <w:rPr>
+          <w:rFonts w:ascii="Times New Roman" w:eastAsia="Times New Roman" w:hAnsi="Times New Roman"/>
+          <w:b/>
+          <w:sz w:val="24"/>
+          <w:szCs w:val="24"/>
+          <w:u w:val="single"/>
+          <w:lang w:val="en-US"/>
+        </w:rPr>
+        <w:t xml:space="preserve">., </w:t>
+      </w:r>
+      <w:proofErr w:type="spellStart"/>
+      <w:r>
+        <w:rPr>
+          <w:rFonts w:ascii="Times New Roman" w:eastAsia="Times New Roman" w:hAnsi="Times New Roman"/>
+          <w:b/>
+          <w:sz w:val="24"/>
+          <w:szCs w:val="24"/>
+          <w:u w:val="single"/>
+          <w:lang w:val="en-US"/>
+        </w:rPr>
+        <w:t>M.Si</w:t>
+      </w:r>
+      <w:proofErr w:type="spellEnd"/>
     </w:p>
     <w:p>
       <w:pPr>
@@ -2432,14 +2815,25 @@
           <w:lang w:val="en-US"/>
         </w:rPr>
       </w:pPr>
-      <w:r>
-        <w:rPr>
-          <w:rFonts w:ascii="Times New Roman" w:eastAsia="Times New Roman" w:hAnsi="Times New Roman"/>
-          <w:sz w:val="24"/>
-          <w:szCs w:val="24"/>
-          <w:lang w:val="en-US"/>
-        </w:rPr>
-        <w:t xml:space="preserve">Catatan: </w:t>
+      <w:proofErr w:type="spellStart"/>
+      <w:r>
+        <w:rPr>
+          <w:rFonts w:ascii="Times New Roman" w:eastAsia="Times New Roman" w:hAnsi="Times New Roman"/>
+          <w:sz w:val="24"/>
+          <w:szCs w:val="24"/>
+          <w:lang w:val="en-US"/>
+        </w:rPr>
+        <w:t>Catatan</w:t>
+      </w:r>
+      <w:proofErr w:type="spellEnd"/>
+      <w:r>
+        <w:rPr>
+          <w:rFonts w:ascii="Times New Roman" w:eastAsia="Times New Roman" w:hAnsi="Times New Roman"/>
+          <w:sz w:val="24"/>
+          <w:szCs w:val="24"/>
+          <w:lang w:val="en-US"/>
+        </w:rPr>
+        <w:t xml:space="preserve">: </w:t>
       </w:r>
     </w:p>
     <w:p>
@@ -2460,8 +2854,39 @@
           <w:szCs w:val="20"/>
           <w:lang w:val="en-US"/>
         </w:rPr>
-        <w:t>*) Coret yang tidak perlu</w:t>
-      </w:r>
+        <w:t xml:space="preserve">*) Coret yang </w:t>
+      </w:r>
+      <w:proofErr w:type="spellStart"/>
+      <w:r>
+        <w:rPr>
+          <w:rFonts w:ascii="Times New Roman" w:eastAsia="Times New Roman" w:hAnsi="Times New Roman"/>
+          <w:sz w:val="20"/>
+          <w:szCs w:val="20"/>
+          <w:lang w:val="en-US"/>
+        </w:rPr>
+        <w:t>tidak</w:t>
+      </w:r>
+      <w:proofErr w:type="spellEnd"/>
+      <w:r>
+        <w:rPr>
+          <w:rFonts w:ascii="Times New Roman" w:eastAsia="Times New Roman" w:hAnsi="Times New Roman"/>
+          <w:sz w:val="20"/>
+          <w:szCs w:val="20"/>
+          <w:lang w:val="en-US"/>
+        </w:rPr>
+        <w:t xml:space="preserve"> </w:t>
+      </w:r>
+      <w:proofErr w:type="spellStart"/>
+      <w:r>
+        <w:rPr>
+          <w:rFonts w:ascii="Times New Roman" w:eastAsia="Times New Roman" w:hAnsi="Times New Roman"/>
+          <w:sz w:val="20"/>
+          <w:szCs w:val="20"/>
+          <w:lang w:val="en-US"/>
+        </w:rPr>
+        <w:t>perlu</w:t>
+      </w:r>
+      <w:proofErr w:type="spellEnd"/>
     </w:p>
     <w:p>
       <w:pPr>
@@ -2481,7 +2906,87 @@
           <w:szCs w:val="20"/>
           <w:lang w:val="en-US"/>
         </w:rPr>
-        <w:t xml:space="preserve">1.  Selang nilai dari setiap Dosen Tim Penilai: 0 – 100 </w:t>
+        <w:t xml:space="preserve">1.  </w:t>
+      </w:r>
+      <w:proofErr w:type="spellStart"/>
+      <w:r>
+        <w:rPr>
+          <w:rFonts w:ascii="Times New Roman" w:eastAsia="Times New Roman" w:hAnsi="Times New Roman"/>
+          <w:sz w:val="20"/>
+          <w:szCs w:val="20"/>
+          <w:lang w:val="en-US"/>
+        </w:rPr>
+        <w:t>Selang</w:t>
+      </w:r>
+      <w:proofErr w:type="spellEnd"/>
+      <w:r>
+        <w:rPr>
+          <w:rFonts w:ascii="Times New Roman" w:eastAsia="Times New Roman" w:hAnsi="Times New Roman"/>
+          <w:sz w:val="20"/>
+          <w:szCs w:val="20"/>
+          <w:lang w:val="en-US"/>
+        </w:rPr>
+        <w:t xml:space="preserve"> </w:t>
+      </w:r>
+      <w:proofErr w:type="spellStart"/>
+      <w:r>
+        <w:rPr>
+          <w:rFonts w:ascii="Times New Roman" w:eastAsia="Times New Roman" w:hAnsi="Times New Roman"/>
+          <w:sz w:val="20"/>
+          <w:szCs w:val="20"/>
+          <w:lang w:val="en-US"/>
+        </w:rPr>
+        <w:t>nilai</w:t>
+      </w:r>
+      <w:proofErr w:type="spellEnd"/>
+      <w:r>
+        <w:rPr>
+          <w:rFonts w:ascii="Times New Roman" w:eastAsia="Times New Roman" w:hAnsi="Times New Roman"/>
+          <w:sz w:val="20"/>
+          <w:szCs w:val="20"/>
+          <w:lang w:val="en-US"/>
+        </w:rPr>
+        <w:t xml:space="preserve"> </w:t>
+      </w:r>
+      <w:proofErr w:type="spellStart"/>
+      <w:r>
+        <w:rPr>
+          <w:rFonts w:ascii="Times New Roman" w:eastAsia="Times New Roman" w:hAnsi="Times New Roman"/>
+          <w:sz w:val="20"/>
+          <w:szCs w:val="20"/>
+          <w:lang w:val="en-US"/>
+        </w:rPr>
+        <w:t>dari</w:t>
+      </w:r>
+      <w:proofErr w:type="spellEnd"/>
+      <w:r>
+        <w:rPr>
+          <w:rFonts w:ascii="Times New Roman" w:eastAsia="Times New Roman" w:hAnsi="Times New Roman"/>
+          <w:sz w:val="20"/>
+          <w:szCs w:val="20"/>
+          <w:lang w:val="en-US"/>
+        </w:rPr>
+        <w:t xml:space="preserve"> </w:t>
+      </w:r>
+      <w:proofErr w:type="spellStart"/>
+      <w:r>
+        <w:rPr>
+          <w:rFonts w:ascii="Times New Roman" w:eastAsia="Times New Roman" w:hAnsi="Times New Roman"/>
+          <w:sz w:val="20"/>
+          <w:szCs w:val="20"/>
+          <w:lang w:val="en-US"/>
+        </w:rPr>
+        <w:t>setiap</w:t>
+      </w:r>
+      <w:proofErr w:type="spellEnd"/>
+      <w:r>
+        <w:rPr>
+          <w:rFonts w:ascii="Times New Roman" w:eastAsia="Times New Roman" w:hAnsi="Times New Roman"/>
+          <w:sz w:val="20"/>
+          <w:szCs w:val="20"/>
+          <w:lang w:val="en-US"/>
+        </w:rPr>
+        <w:t xml:space="preserve"> Dosen Tim Penilai: 0 – 100 </w:t>
       </w:r>
     </w:p>
     <w:p>
@@ -2501,7 +3006,7 @@
           <w:lang w:val="en-US"/>
         </w:rPr>
         <w:drawing>
-          <wp:anchor distT="0" distB="0" distL="114300" distR="114300" simplePos="0" relativeHeight="251662848" behindDoc="0" locked="0" layoutInCell="1" allowOverlap="1" wp14:anchorId="4C4CD396" wp14:editId="2C667D7F">
+          <wp:anchor distT="0" distB="0" distL="114300" distR="114300" simplePos="0" relativeHeight="251662848" behindDoc="0" locked="0" layoutInCell="1" allowOverlap="1" wp14:anchorId="4C4CD396" wp14:editId="3155A27C">
             <wp:simplePos x="0" y="0"/>
             <wp:positionH relativeFrom="column">
               <wp:posOffset>6170295</wp:posOffset>
@@ -2570,7 +3075,67 @@
           <w:szCs w:val="20"/>
           <w:lang w:val="en-US"/>
         </w:rPr>
-        <w:t xml:space="preserve">2.  Selang nilai seminar: A </w:t>
+        <w:t xml:space="preserve">2.  </w:t>
+      </w:r>
+      <w:proofErr w:type="spellStart"/>
+      <w:r>
+        <w:rPr>
+          <w:rFonts w:ascii="Times New Roman" w:eastAsia="Times New Roman" w:hAnsi="Times New Roman"/>
+          <w:sz w:val="20"/>
+          <w:szCs w:val="20"/>
+          <w:lang w:val="en-US"/>
+        </w:rPr>
+        <w:t>Selang</w:t>
+      </w:r>
+      <w:proofErr w:type="spellEnd"/>
+      <w:r>
+        <w:rPr>
+          <w:rFonts w:ascii="Times New Roman" w:eastAsia="Times New Roman" w:hAnsi="Times New Roman"/>
+          <w:sz w:val="20"/>
+          <w:szCs w:val="20"/>
+          <w:lang w:val="en-US"/>
+        </w:rPr>
+        <w:t xml:space="preserve"> </w:t>
+      </w:r>
+      <w:proofErr w:type="spellStart"/>
+      <w:r>
+        <w:rPr>
+          <w:rFonts w:ascii="Times New Roman" w:eastAsia="Times New Roman" w:hAnsi="Times New Roman"/>
+          <w:sz w:val="20"/>
+          <w:szCs w:val="20"/>
+          <w:lang w:val="en-US"/>
+        </w:rPr>
+        <w:t>nilai</w:t>
+      </w:r>
+      <w:proofErr w:type="spellEnd"/>
+      <w:r>
+        <w:rPr>
+          <w:rFonts w:ascii="Times New Roman" w:eastAsia="Times New Roman" w:hAnsi="Times New Roman"/>
+          <w:sz w:val="20"/>
+          <w:szCs w:val="20"/>
+          <w:lang w:val="en-US"/>
+        </w:rPr>
+        <w:t xml:space="preserve"> </w:t>
+      </w:r>
+      <w:proofErr w:type="spellStart"/>
+      <w:r>
+        <w:rPr>
+          <w:rFonts w:ascii="Times New Roman" w:eastAsia="Times New Roman" w:hAnsi="Times New Roman"/>
+          <w:sz w:val="20"/>
+          <w:szCs w:val="20"/>
+          <w:lang w:val="en-US"/>
+        </w:rPr>
+        <w:t>kolokium</w:t>
+      </w:r>
+      <w:proofErr w:type="spellEnd"/>
+      <w:r>
+        <w:rPr>
+          <w:rFonts w:ascii="Times New Roman" w:eastAsia="Times New Roman" w:hAnsi="Times New Roman"/>
+          <w:sz w:val="20"/>
+          <w:szCs w:val="20"/>
+          <w:lang w:val="en-US"/>
+        </w:rPr>
+        <w:t xml:space="preserve">: A </w:t>
       </w:r>
       <w:r>
         <w:rPr>
@@ -4668,12 +5233,13 @@
       <w:lang w:val="id-ID"/>
     </w:rPr>
   </w:style>
-  <w:style w:type="character" w:default="1" w:styleId="FontParagrafDefault">
+  <w:style w:type="character" w:default="1" w:styleId="DefaultParagraphFont">
     <w:name w:val="Default Paragraph Font"/>
     <w:uiPriority w:val="1"/>
+    <w:semiHidden/>
     <w:unhideWhenUsed/>
   </w:style>
-  <w:style w:type="table" w:default="1" w:styleId="TabelNormal">
+  <w:style w:type="table" w:default="1" w:styleId="TableNormal">
     <w:name w:val="Normal Table"/>
     <w:uiPriority w:val="99"/>
     <w:semiHidden/>
@@ -4688,13 +5254,13 @@
       </w:tblCellMar>
     </w:tblPr>
   </w:style>
-  <w:style w:type="numbering" w:default="1" w:styleId="TidakAdaDaftar">
+  <w:style w:type="numbering" w:default="1" w:styleId="NoList">
     <w:name w:val="No List"/>
     <w:uiPriority w:val="99"/>
     <w:semiHidden/>
     <w:unhideWhenUsed/>
   </w:style>
-  <w:style w:type="paragraph" w:styleId="DaftarParagraf">
+  <w:style w:type="paragraph" w:styleId="ListParagraph">
     <w:name w:val="List Paragraph"/>
     <w:basedOn w:val="Normal"/>
     <w:uiPriority w:val="34"/>
@@ -4715,10 +5281,10 @@
       <w:u w:val="single"/>
     </w:rPr>
   </w:style>
-  <w:style w:type="paragraph" w:styleId="TeksBalon">
+  <w:style w:type="paragraph" w:styleId="BalloonText">
     <w:name w:val="Balloon Text"/>
     <w:basedOn w:val="Normal"/>
-    <w:link w:val="TeksBalonKAR"/>
+    <w:link w:val="BalloonTextChar"/>
     <w:uiPriority w:val="99"/>
     <w:semiHidden/>
     <w:unhideWhenUsed/>
@@ -4732,9 +5298,9 @@
       <w:szCs w:val="16"/>
     </w:rPr>
   </w:style>
-  <w:style w:type="character" w:customStyle="1" w:styleId="TeksBalonKAR">
-    <w:name w:val="Teks Balon KAR"/>
-    <w:link w:val="TeksBalon"/>
+  <w:style w:type="character" w:customStyle="1" w:styleId="BalloonTextChar">
+    <w:name w:val="Balloon Text Char"/>
+    <w:link w:val="BalloonText"/>
     <w:uiPriority w:val="99"/>
     <w:semiHidden/>
     <w:rsid w:val="007731F1"/>
@@ -4744,7 +5310,7 @@
       <w:szCs w:val="16"/>
     </w:rPr>
   </w:style>
-  <w:style w:type="paragraph" w:styleId="TidakAdaSpasi">
+  <w:style w:type="paragraph" w:styleId="NoSpacing">
     <w:name w:val="No Spacing"/>
     <w:uiPriority w:val="1"/>
     <w:qFormat/>
@@ -4757,8 +5323,8 @@
   </w:style>
   <w:style w:type="table" w:customStyle="1" w:styleId="TableGrid1">
     <w:name w:val="Table Grid1"/>
-    <w:basedOn w:val="TabelNormal"/>
-    <w:next w:val="KisiTabel"/>
+    <w:basedOn w:val="TableNormal"/>
+    <w:next w:val="TableGrid"/>
     <w:uiPriority w:val="39"/>
     <w:rsid w:val="00EA3211"/>
     <w:rPr>
@@ -4776,9 +5342,9 @@
       </w:tblBorders>
     </w:tblPr>
   </w:style>
-  <w:style w:type="table" w:styleId="KisiTabel">
+  <w:style w:type="table" w:styleId="TableGrid">
     <w:name w:val="Table Grid"/>
-    <w:basedOn w:val="TabelNormal"/>
+    <w:basedOn w:val="TableNormal"/>
     <w:uiPriority w:val="59"/>
     <w:rsid w:val="00EA3211"/>
     <w:tblPr>

</xml_diff>